<commit_message>
docs(week5): make form 4 materials company-independent
Drop the "existing security app" deployment path. The concept is now a
standalone app (no "gambling" in name/icon/listing), reached through the
"how to quit" search moment and 1336/counselor referral, with the
detection engine split out as an SDK for later embedding. Updated the
form 4 docx (§1.3, NABC, TO-BE 1, §3.5, §4.2, §4.3, 2.2.1 note), the
concept screens image, and the public presentation copy.

Co-Authored-By: Claude Fable 5.1 <noreply@anthropic.com>
</commit_message>
<xml_diff>
--- a/docs/week5/form4_problem-definition.docx
+++ b/docs/week5/form4_problem-definition.docx
@@ -2412,7 +2412,7 @@
                 <w:b w:val="0"/>
                 <w:sz w:val="19"/>
               </w:rPr>
-              <w:t xml:space="preserve"> 주소와 무관하게 화면 내용(OCR 텍스트·시각 특징)으로 도박 진입 화면과 충전 직전 화면을 온디바이스에서 판정하고, 청소년 본인이 켜 둔 약속·누적 손실과 함께 "이것은 불법 도박"임을 알아채게 하며, 충전 직전에는 30초의 간격을 만든다. 기본값이 차단이 아니라 인지와 마찰이고 차단은 본인이 미리 고른 경우에만 켜지므로(사전 약속) 삭제 유인이 낮고, 켜는 것·알리는 것·끄는 것을 본인이 정하므로 감시가 아니다. 운영 중인 보안 앱의 "내 폰 보호" 기능으로 탑재해 설치 장벽을 없앤다.</w:t>
+              <w:t xml:space="preserve"> 주소와 무관하게 화면 내용(OCR 텍스트·시각 특징)으로 도박 진입 화면과 충전 직전 화면을 온디바이스에서 판정하고, 청소년 본인이 켜 둔 약속·누적 손실과 함께 "이것은 불법 도박"임을 알아채게 하며, 충전 직전에는 30초의 간격을 만든다. 기본값이 차단이 아니라 인지와 마찰이고 차단은 본인이 미리 고른 경우에만 켜지므로(사전 약속) 삭제 유인이 낮고, 켜는 것·알리는 것·끄는 것을 본인이 정하므로 감시가 아니다. 독립 앱 「멈칫」으로 만들되 이름·아이콘·스토어 설명에 "도박"을 드러내지 않아 폰에 흔적이 남지 않게 하고, "도박 그만하는 법"을 검색하는 순간과 1336·치유원·Wee클래스 상담사의 권고를 설치 경로로 삼는다. 판정 엔진은 SDK로 분리해 다른 앱이 탑재할 수 있게 한다(후속).</w:t>
             </w:r>
           </w:p>
           <w:p>
@@ -3186,7 +3186,7 @@
           <w:b w:val="0"/>
           <w:sz w:val="17"/>
         </w:rPr>
-        <w:t>※ 번호는 양식 3 §3.3의 아이디어 번호(①~㉚)이며, ㉛ 끊기 약속 설정(문구·기간·끄기 지연) · ㉜ 재접속 약속 카드(판정 근거+약속+누적 손실) · ㉝ 잃은 돈 장부(충전 금액을 본인 확인으로 기기 안에 누적)는 5주차 타깃 재선정 후 추가 발산한 아이디어다. 의사결정 그리드(중요도×실현가능성) 결과 부가 기능으로 분류한 것은 ⑪ 주간 요약(신뢰인용→본인용 "나의 기록"으로 전환), ⑦ 게임 vs 도박 퀴즈, ⑬ 합법 대안 안내, ⑰ 대화 가이드이고, 이번 학기 제외는 ⑥ 자동 신고, ⑨ 링크 미리보기 검사, ⑩ 지역 대시보드, ⑯ 데이터 리워드, ㉔ 계좌 연동, ㉙㉚ 설치 채널이다.</w:t>
+        <w:t>※ 번호는 양식 3 §3.3의 아이디어 번호(①~㉚)이며, ㉛ 끊기 약속 설정(문구·기간·끄기 지연) · ㉜ 재접속 약속 카드(판정 근거+약속+누적 손실) · ㉝ 잃은 돈 장부(충전 금액을 본인 확인으로 기기 안에 누적)는 5주차 타깃 재선정 후 추가 발산한 아이디어다. 의사결정 그리드(중요도×실현가능성) 결과 부가 기능으로 분류한 것은 ⑪ 주간 요약(신뢰인용→본인용 "나의 기록"으로 전환), ⑦ 게임 vs 도박 퀴즈, ⑬ 합법 대안 안내, ⑰ 대화 가이드이고, 이번 학기 제외는 ⑥ 자동 신고, ⑨ 링크 미리보기 검사, ⑩ 지역 대시보드, ⑯ 데이터 리워드, ㉔ 계좌 연동, ㉙㉚ 설치 채널, 그리고 ㉕ 기존 보안 앱 기능과의 결합이다. ㉕는 특정 회사 앱에 묶여 공개·재현이 어려우므로 이번 과제는 독립 앱으로 검증하고, 판정 엔진을 SDK로 분리하는 것으로 대체한다.</w:t>
       </w:r>
     </w:p>
     <w:p>
@@ -3390,7 +3390,7 @@
                 <w:b w:val="0"/>
                 <w:sz w:val="17"/>
               </w:rPr>
-              <w:t>‣ 운영 중인 보안 앱의 "내 폰 보호"(피싱·스미싱·사기 사이트 차단) 안에 도박 브레이크를 넣고, 본인이 끊기 약속을 켜며 신뢰인을 지정한다(선택).</w:t>
+              <w:t>‣ 독립 앱 「멈칫」을 본인이 설치해 끊기 약속을 켜고 신뢰인을 지정한다(선택). 이름·아이콘·스토어 설명에 "도박"을 쓰지 않아 폰에 흔적이 남지 않는다. 설치 경로는 "도박 그만하는 법" 검색 순간과 1336·치유원·Wee클래스의 권고.</w:t>
             </w:r>
           </w:p>
           <w:p>
@@ -3556,7 +3556,7 @@
                 <w:b w:val="0"/>
                 <w:sz w:val="17"/>
               </w:rPr>
-              <w:t>‣ 우리: 운영 앱의 차별 기능(청소년 보호), 한국어 도박 화면 데이터셋·융합 모델 비교 결과(논문·공개 메타데이터), 다른 집단(장병 등)으로의 확장 기반.</w:t>
+              <w:t>‣ 우리: 한국어 도박 화면 데이터셋·융합 모델 비교 결과(논문·공개 메타데이터), 다른 앱이 탑재할 수 있는 판정 엔진(SDK), 다른 집단(장병 등)으로의 확장 기반.</w:t>
             </w:r>
           </w:p>
         </w:tc>
@@ -3589,7 +3589,7 @@
                 <w:b w:val="0"/>
                 <w:sz w:val="17"/>
               </w:rPr>
-              <w:t>우리의 강점: ⑴ 주소가 바뀌어도 화면으로 판정 ⑵ 차단이 아니라 "알아채기 + 마찰"이라 삭제 유인이 낮음 ⑶ 켜기·알리기·끄기를 본인이 정하는 감시 없는 설계 ⑷ 이미 배포 중인 보안 앱에 탑재해 설치 장벽 없음 ⑸ 한국어 모바일 화면 온디바이스 추론 ⑹ 상담·치유 체계와 경쟁하지 않고 앞단에서 연결.</w:t>
+              <w:t>우리의 강점: ⑴ 주소가 바뀌어도 화면으로 판정 ⑵ 차단이 아니라 "알아채기 + 마찰"이라 삭제 유인이 낮음 ⑶ 켜기·알리기·끄기를 본인이 정하는 감시 없는 설계 ⑷ 특정 앱·회사에 묶이지 않는 독립 앱, 판정 엔진은 SDK로 분리해 다른 앱도 탑재 가능 ⑸ 한국어 모바일 화면 온디바이스 추론 ⑹ 상담·치유 체계와 경쟁하지 않고 앞단에서 연결.</w:t>
             </w:r>
           </w:p>
         </w:tc>
@@ -6781,7 +6781,7 @@
                 <w:b w:val="0"/>
                 <w:sz w:val="19"/>
               </w:rPr>
-              <w:t xml:space="preserve"> ① 준혁이 보안 앱 "내 폰 보호"에서 도박 브레이크를 켠다. 약속 문구 "다시 안 한다. 잃은 180만 원을 기억한다", 기간 90일, 시작 금액 180만 원(본인 입력), 개입 강도 "멈칫하기"(기본), 신뢰인은 사촌 형(충전 시도 때만, 금액·유형만). ② 금요일 밤 단톡방 새 주소를 누른다. ③ 주소와 무관하게 화면이 판정되어 약속 카드가 뜬다: "불법 도박 사이트로 판정됨 · 근거: 첫 충전 보너스·실시간 배당 문구, 카지노형 UI / 네 약속 / 끊은 지 3일 · 잃은 돈 180만 원" [나가기(기본)]. ④ 나가기를 누른다. 기기 안 기록에 "멈춤 1회"가 남는다. ⑤ 계속 보기는 60초 뒤에만 열리고, 그래도 들어가면 충전 화면에서 TO-BE 2가 작동한다. ⇒ 해소: 들어가는 순간의 신호 부재(새 주소 무관 판정), 약속 부재(약속 카드).</w:t>
+              <w:t xml:space="preserve"> ① 준혁이 "도박 그만하는 법"을 검색하다 「멈칫」을 알게 되어 설치하고 브레이크를 켠다(앱 이름·아이콘에 "도박"이 없어 폰을 봐도 티가 나지 않는다). 약속 문구 "다시 안 한다. 잃은 180만 원을 기억한다", 기간 90일, 시작 금액 180만 원(본인 입력), 개입 강도 "멈칫하기"(기본), 신뢰인은 사촌 형(충전 시도 때만, 금액·유형만). ② 금요일 밤 단톡방 새 주소를 누른다. ③ 주소와 무관하게 화면이 판정되어 약속 카드가 뜬다: "불법 도박 사이트로 판정됨 · 근거: 첫 충전 보너스·실시간 배당 문구, 카지노형 UI / 네 약속 / 끊은 지 3일 · 잃은 돈 180만 원" [나가기(기본)]. ④ 나가기를 누른다. 기기 안 기록에 "멈춤 1회"가 남는다. ⑤ 계속 보기는 60초 뒤에만 열리고, 그래도 들어가면 충전 화면에서 TO-BE 2가 작동한다. ⇒ 해소: 들어가는 순간의 신호 부재(새 주소 무관 판정), 약속 부재(약속 카드).</w:t>
             </w:r>
           </w:p>
           <w:p>
@@ -8355,7 +8355,7 @@
                 <w:b w:val="0"/>
                 <w:sz w:val="17"/>
               </w:rPr>
-              <w:t>모델 실험 생태계가 가장 넓고, 운영 중인 보안 앱의 안드로이드 네이티브 계층과 같은 언어라 탑재가 쉬움</w:t>
+              <w:t>모델 실험 생태계가 가장 넓고, 안드로이드 접근성·화면 캡처·TFLite 추론이 모두 네이티브(Kotlin) 표준 경로라 독립 앱으로 바로 만들 수 있음</w:t>
             </w:r>
           </w:p>
         </w:tc>
@@ -10387,7 +10387,7 @@
                 <w:b w:val="0"/>
                 <w:sz w:val="17"/>
               </w:rPr>
-              <w:t>경량화(TFLite 50MB·1초) 실기기 측정, 비즈니스 모델(보안 앱 탑재·B2B2C 채널) 작성</w:t>
+              <w:t>경량화(TFLite 50MB·1초) 실기기 측정, 비즈니스 모델(공공 보급: 치유원·교육청 채널 / 판정 엔진 SDK 라이선스) 작성</w:t>
             </w:r>
           </w:p>
         </w:tc>
@@ -11173,7 +11173,7 @@
                 <w:b w:val="0"/>
                 <w:sz w:val="17"/>
               </w:rPr>
-              <w:t>접근성 이벤트 + 캡처의 2경로 설계, 판정 트리거를 앱·URL 전환 시점으로 제한, 1초·50MB 지표, Play 정책 사전 검토</w:t>
+              <w:t>접근성 이벤트 + 캡처의 2경로 설계, 판정 트리거를 앱·URL 전환 시점으로 제한, 1초·50MB 지표. 연구 범위는 테스트 기기 직접 설치로 검증하고, Play 접근성 정책 심사는 배포 단계(후속)에서 대응</w:t>
             </w:r>
           </w:p>
         </w:tc>

</xml_diff>